<commit_message>
Replace Relate cases with Week 9 book selection and Week 5 land-based guidance
Co-Authored-By: Claude Opus 5.5 <noreply@anthropic.com>
Claude-Session: https://claude.ai/code/session_013ny5NBhAjS6JareazUFgQN
</commit_message>
<xml_diff>
--- a/Jiecheng_Yang_ECL3203_BC_Participant_Report_revised.docx
+++ b/Jiecheng_Yang_ECL3203_BC_Participant_Report_revised.docx
@@ -100,7 +100,25 @@
           <w:sz w:val="24"/>
           <w:szCs w:val="24"/>
         </w:rPr>
-        <w:t>During my internship at Parkdale Child Care Centre, I reviewed Storypark learning stories and decided that connecting a child’s magnetic-tile tower to an Indigenous framework would have been tokenistic. In my view, the framework belonged only where it honestly matched what children were doing. The BC framework pushed me to take this judgment a step further. Deciding where a framework fits is still my own interpretation, and displaying or applying Indigenous content does not by itself give an educator the authority to interpret or share it. Respectful practice also depends on asking whose knowledge it is, who may share it, and under what protocols.</w:t>
+        <w:t xml:space="preserve">At Parkdale, I worked with my supervisor, Anna, to select children’s books for the Parent Resource Library. Our choices included </w:t>
+      </w:r>
+      <w:r>
+        <w:rPr>
+          <w:i/>
+        </w:rPr>
+        <w:t>We Sang You Home</w:t>
+      </w:r>
+      <w:r>
+        <w:t xml:space="preserve"> and </w:t>
+      </w:r>
+      <w:r>
+        <w:rPr>
+          <w:i/>
+        </w:rPr>
+        <w:t>Blackflies</w:t>
+      </w:r>
+      <w:r>
+        <w:t>, and we considered Indigenous representation, family relationships, and children’s everyday experiences. I also built a bilingual book list recording each title’s author, age range, and themes. The BC framework raised a question our process did not address. Selecting these books was still our decision, so whose interpretation guides how families and children read them? Placing Indigenous books on a shelf increases representation, but it does not give educators the authority to interpret the knowledge they carry.</w:t>
       </w:r>
     </w:p>
     <w:p>
@@ -183,7 +201,16 @@
           <w:sz w:val="24"/>
           <w:szCs w:val="24"/>
         </w:rPr>
-        <w:t>This contrast in transportation reminded me of a Toronto Zoo excursion during my internship. Before I rode the school bus with nine Kindergarten 1 children, my supervisor and the team had already arranged buses, staffing, family volunteers, meals, and a weather backup plan. A zoo trip is not Indigenous land-based learning. Still, both cases suggest that practical resources, especially transportation, sit between an educational vision and children’s actual participation. One educator’s goodwill cannot remove these barriers alone; program leaders and funders need to share that responsibility.</w:t>
+        <w:t xml:space="preserve">At Parkdale, I observed Anna reminding student educators that land-based learning is not simply taking children outdoors; it requires clear intention, stewardship, and continuity. </w:t>
+      </w:r>
+      <w:r>
+        <w:rPr>
+          <w:i/>
+        </w:rPr>
+        <w:t>Impact Stories</w:t>
+      </w:r>
+      <w:r>
+        <w:t xml:space="preserve"> moved my attention from intention to access. Transportation is what brings Kwantlen children to the Elders’ program, while the Nak’azdi Whut’en educator still needs a vehicle to take children onto the land. Educational intention defines what land-based learning should be, but it does not make that learning possible on its own. Regular access depends on resources that program leaders and funders, not individual educators, are positioned to secure.</w:t>
       </w:r>
     </w:p>
     <w:p>

</xml_diff>

<commit_message>
Add name line, soften two claims, keep report to one page
Co-Authored-By: Claude Opus 5.5 <noreply@anthropic.com>
Claude-Session: https://claude.ai/code/session_013ny5NBhAjS6JareazUFgQN
</commit_message>
<xml_diff>
--- a/Jiecheng_Yang_ECL3203_BC_Participant_Report_revised.docx
+++ b/Jiecheng_Yang_ECL3203_BC_Participant_Report_revised.docx
@@ -22,6 +22,24 @@
     </w:p>
     <w:p>
       <w:pPr>
+        <w:spacing w:after="80" w:line="264" w:lineRule="auto"/>
+        <w:jc w:val="center"/>
+      </w:pPr>
+      <w:bookmarkStart w:id="0" w:name="_GoBack"/>
+      <w:bookmarkEnd w:id="0"/>
+      <w:r>
+        <w:rPr>
+          <w:rFonts w:ascii="Times New Roman" w:hAnsi="Times New Roman" w:eastAsia="Times New Roman" w:cs="Times New Roman"/>
+          <w:b w:val="0"/>
+          <w:bCs/>
+          <w:sz w:val="24"/>
+          <w:szCs w:val="24"/>
+        </w:rPr>
+        <w:t>Jiecheng Yang | ECL3203</w:t>
+      </w:r>
+    </w:p>
+    <w:p>
+      <w:pPr>
         <w:spacing w:before="100" w:after="60" w:line="264" w:lineRule="auto"/>
       </w:pPr>
       <w:r>
@@ -118,7 +136,7 @@
         <w:t>Blackflies</w:t>
       </w:r>
       <w:r>
-        <w:t>, and we considered Indigenous representation, family relationships, and children’s everyday experiences. I also built a bilingual book list recording each title’s author, age range, and themes. The BC framework raised a question our process did not address. Selecting these books was still our decision, so whose interpretation guides how families and children read them? Placing Indigenous books on a shelf increases representation, but it does not give educators the authority to interpret the knowledge they carry.</w:t>
+        <w:t>, and we considered Indigenous representation, family relationships, and children’s daily experiences. I also recorded each title’s author, age range, and themes in a bilingual list. The BC framework raised a question we had not asked. The selection was still our decision, so whose interpretation guides how families read them? Shelving Indigenous books adds representation, but it does not automatically give educators the authority to interpret all the cultural knowledge they carry.</w:t>
       </w:r>
     </w:p>
     <w:p>
@@ -176,7 +194,7 @@
           <w:sz w:val="24"/>
           <w:szCs w:val="24"/>
         </w:rPr>
-        <w:t xml:space="preserve"> (n.d.), a Kwantlen Head Start manager explains that transportation allows children who live across the river to attend a program where Elders share language, cooking, weaving, and dance. In the Nak’azdi Whut’en segment, an educator describes needing a vehicle to take children onto the land and on outings, yet mentions only a possible source of support.</w:t>
+        <w:t xml:space="preserve"> (n.d.), a Kwantlen Head Start manager explains that transportation allows children living across the river to attend a program where Elders share language, cooking, weaving, and dance. A Nak’azdi Whut’en educator describes needing a vehicle to take children onto the land and on trips but names only a possible source of support.</w:t>
       </w:r>
     </w:p>
     <w:p>
@@ -210,7 +228,7 @@
         <w:t>Impact Stories</w:t>
       </w:r>
       <w:r>
-        <w:t xml:space="preserve"> moved my attention from intention to access. Transportation is what brings Kwantlen children to the Elders’ program, while the Nak’azdi Whut’en educator still needs a vehicle to take children onto the land. Educational intention defines what land-based learning should be, but it does not make that learning possible on its own. Regular access depends on resources that program leaders and funders, not individual educators, are positioned to secure.</w:t>
+        <w:t xml:space="preserve"> moved my attention from intention to access. Transportation brings Kwantlen children to the Elders’ program, while the Nak’azdi Whut’en educator still needs a vehicle to take children onto the land. Educational intention matters, but it cannot make community-led land-based learning possible on its own. Regular access depends on resources that program leaders and funders, not individual educators, are positioned to secure.</w:t>
       </w:r>
     </w:p>
     <w:p>

</xml_diff>